<commit_message>
docs(paper): regenerate _omml.docx with §6.4 batch variance + fig8
Both EN and RU paper_omml.docx regenerated via pandoc --mathml --standalone
to include:
- §6.4 batch variance scaling discussion (1/√B does not hold empirically)
- fig8 (batch_variance histogram, 6-panel, 300 DPI)
- §6.5 Reviewer response: multi-direction SPSA (K=3 ablation result)
- §6.6 (RU) / inline (EN) constant lr choice discussion

File sizes: 2.15 MB (EN), 2.16 MB (RU) — up from 1.86/1.87 MB (added fig8
+ ~3 new paragraphs in each language).

Co-Authored-By: Claude Opus 4.7 (1M context) <noreply@anthropic.com>
</commit_message>
<xml_diff>
--- a/docs/D-MeZO-N_paper_omml.docx
+++ b/docs/D-MeZO-N_paper_omml.docx
@@ -8253,7 +8253,7 @@
     </w:p>
     <w:bookmarkEnd w:id="43"/>
     <w:bookmarkEnd w:id="44"/>
-    <w:bookmarkStart w:id="45" w:name="discussion"/>
+    <w:bookmarkStart w:id="48" w:name="discussion"/>
     <w:p>
       <w:pPr>
         <w:pStyle w:val="Heading1"/>
@@ -8672,8 +8672,1265 @@
         <w:t xml:space="preserve">, doubly-stochastic mixing matrix.</w:t>
       </w:r>
     </w:p>
-    <w:bookmarkEnd w:id="45"/>
-    <w:bookmarkStart w:id="46" w:name="limitations-and-future-work"/>
+    <w:p>
+      <w:pPr>
+        <w:pStyle w:val="BodyText"/>
+      </w:pPr>
+      <w:r>
+        <w:rPr>
+          <w:b/>
+          <w:bCs/>
+        </w:rPr>
+        <w:t xml:space="preserve">Batch-size variance scaling (empirical: 1/√B does NOT hold).</w:t>
+      </w:r>
+      <w:r>
+        <w:t xml:space="preserve"> </w:t>
+      </w:r>
+      <w:r>
+        <w:t xml:space="preserve">Standard CLT predicts that the per-step ρ-estimator variance shrinks as</w:t>
+      </w:r>
+      <w:r>
+        <w:t xml:space="preserve"> </w:t>
+      </w:r>
+      <m:oMath>
+        <m:r>
+          <m:t>1</m:t>
+        </m:r>
+        <m:r>
+          <m:rPr>
+            <m:sty m:val="p"/>
+          </m:rPr>
+          <m:t>/</m:t>
+        </m:r>
+        <m:r>
+          <m:t>B</m:t>
+        </m:r>
+      </m:oMath>
+      <w:r>
+        <w:t xml:space="preserve"> </w:t>
+      </w:r>
+      <w:r>
+        <w:t xml:space="preserve">with mini-batch size, i.e. std</w:t>
+      </w:r>
+      <w:r>
+        <w:t xml:space="preserve"> </w:t>
+      </w:r>
+      <m:oMath>
+        <m:r>
+          <m:rPr>
+            <m:sty m:val="p"/>
+          </m:rPr>
+          <m:t>∝</m:t>
+        </m:r>
+        <m:r>
+          <m:t>1</m:t>
+        </m:r>
+        <m:r>
+          <m:rPr>
+            <m:sty m:val="p"/>
+          </m:rPr>
+          <m:t>/</m:t>
+        </m:r>
+        <m:rad>
+          <m:radPr>
+            <m:degHide m:val="on"/>
+          </m:radPr>
+          <m:deg/>
+          <m:e>
+            <m:r>
+              <m:t>B</m:t>
+            </m:r>
+          </m:e>
+        </m:rad>
+      </m:oMath>
+      <w:r>
+        <w:t xml:space="preserve">. We tested this on Qwen3-0.6B / SST-2 with</w:t>
+      </w:r>
+      <w:r>
+        <w:t xml:space="preserve"> </w:t>
+      </w:r>
+      <m:oMath>
+        <m:r>
+          <m:t>z</m:t>
+        </m:r>
+      </m:oMath>
+      <w:r>
+        <w:t xml:space="preserve"> </w:t>
+      </w:r>
+      <w:r>
+        <w:t xml:space="preserve">fixed across 100 random batches per</w:t>
+      </w:r>
+      <w:r>
+        <w:t xml:space="preserve"> </w:t>
+      </w:r>
+      <m:oMath>
+        <m:r>
+          <m:t>B</m:t>
+        </m:r>
+        <m:r>
+          <m:rPr>
+            <m:sty m:val="p"/>
+          </m:rPr>
+          <m:t>∈</m:t>
+        </m:r>
+        <m:r>
+          <m:rPr>
+            <m:sty m:val="p"/>
+          </m:rPr>
+          <m:t>{</m:t>
+        </m:r>
+        <m:r>
+          <m:t>1</m:t>
+        </m:r>
+        <m:r>
+          <m:rPr>
+            <m:sty m:val="p"/>
+          </m:rPr>
+          <m:t>,</m:t>
+        </m:r>
+        <m:r>
+          <m:t>2</m:t>
+        </m:r>
+        <m:r>
+          <m:rPr>
+            <m:sty m:val="p"/>
+          </m:rPr>
+          <m:t>,</m:t>
+        </m:r>
+        <m:r>
+          <m:t>4</m:t>
+        </m:r>
+        <m:r>
+          <m:rPr>
+            <m:sty m:val="p"/>
+          </m:rPr>
+          <m:t>,</m:t>
+        </m:r>
+        <m:r>
+          <m:t>8</m:t>
+        </m:r>
+        <m:r>
+          <m:rPr>
+            <m:sty m:val="p"/>
+          </m:rPr>
+          <m:t>,</m:t>
+        </m:r>
+        <m:r>
+          <m:t>16</m:t>
+        </m:r>
+        <m:r>
+          <m:rPr>
+            <m:sty m:val="p"/>
+          </m:rPr>
+          <m:t>,</m:t>
+        </m:r>
+        <m:r>
+          <m:t>32</m:t>
+        </m:r>
+        <m:r>
+          <m:rPr>
+            <m:sty m:val="p"/>
+          </m:rPr>
+          <m:t>}</m:t>
+        </m:r>
+      </m:oMath>
+      <w:r>
+        <w:t xml:space="preserve"> </w:t>
+      </w:r>
+      <w:r>
+        <w:t xml:space="preserve">(Figure 8). The observed std plateaus at</w:t>
+      </w:r>
+      <w:r>
+        <w:t xml:space="preserve"> </w:t>
+      </w:r>
+      <m:oMath>
+        <m:r>
+          <m:t>B</m:t>
+        </m:r>
+        <m:r>
+          <m:rPr>
+            <m:sty m:val="p"/>
+          </m:rPr>
+          <m:t>≥</m:t>
+        </m:r>
+        <m:r>
+          <m:t>8</m:t>
+        </m:r>
+      </m:oMath>
+      <w:r>
+        <w:t xml:space="preserve"> </w:t>
+      </w:r>
+      <w:r>
+        <w:t xml:space="preserve">with ratio (observed / CLT-expected) growing from</w:t>
+      </w:r>
+      <w:r>
+        <w:t xml:space="preserve"> </w:t>
+      </w:r>
+      <m:oMath>
+        <m:r>
+          <m:t>1.55</m:t>
+        </m:r>
+        <m:r>
+          <m:rPr>
+            <m:sty m:val="p"/>
+          </m:rPr>
+          <m:t>×</m:t>
+        </m:r>
+      </m:oMath>
+      <w:r>
+        <w:t xml:space="preserve"> </w:t>
+      </w:r>
+      <w:r>
+        <w:t xml:space="preserve">(B=2) to</w:t>
+      </w:r>
+      <w:r>
+        <w:t xml:space="preserve"> </w:t>
+      </w:r>
+      <m:oMath>
+        <m:r>
+          <m:t>3.43</m:t>
+        </m:r>
+        <m:r>
+          <m:rPr>
+            <m:sty m:val="p"/>
+          </m:rPr>
+          <m:t>×</m:t>
+        </m:r>
+      </m:oMath>
+      <w:r>
+        <w:t xml:space="preserve"> </w:t>
+      </w:r>
+      <w:r>
+        <w:t xml:space="preserve">(B=32). This implies the dominant noise source in MeZO is</w:t>
+      </w:r>
+      <w:r>
+        <w:t xml:space="preserve"> </w:t>
+      </w:r>
+      <w:r>
+        <w:rPr>
+          <w:b/>
+          <w:bCs/>
+        </w:rPr>
+        <w:t xml:space="preserve">not</w:t>
+      </w:r>
+      <w:r>
+        <w:t xml:space="preserve"> </w:t>
+      </w:r>
+      <w:r>
+        <w:t xml:space="preserve">data sampling — it is the choice of direction</w:t>
+      </w:r>
+      <w:r>
+        <w:t xml:space="preserve"> </w:t>
+      </w:r>
+      <m:oMath>
+        <m:r>
+          <m:t>z</m:t>
+        </m:r>
+      </m:oMath>
+      <w:r>
+        <w:t xml:space="preserve"> </w:t>
+      </w:r>
+      <w:r>
+        <w:t xml:space="preserve">itself (and, secondarily, low-precision arithmetic in the loss difference</w:t>
+      </w:r>
+      <w:r>
+        <w:t xml:space="preserve"> </w:t>
+      </w:r>
+      <m:oMath>
+        <m:sSub>
+          <m:e>
+            <m:r>
+              <m:t>L</m:t>
+            </m:r>
+          </m:e>
+          <m:sub>
+            <m:r>
+              <m:rPr>
+                <m:sty m:val="p"/>
+              </m:rPr>
+              <m:t>+</m:t>
+            </m:r>
+          </m:sub>
+        </m:sSub>
+        <m:r>
+          <m:rPr>
+            <m:sty m:val="p"/>
+          </m:rPr>
+          <m:t>−</m:t>
+        </m:r>
+        <m:sSub>
+          <m:e>
+            <m:r>
+              <m:t>L</m:t>
+            </m:r>
+          </m:e>
+          <m:sub>
+            <m:r>
+              <m:rPr>
+                <m:sty m:val="p"/>
+              </m:rPr>
+              <m:t>−</m:t>
+            </m:r>
+          </m:sub>
+        </m:sSub>
+      </m:oMath>
+      <w:r>
+        <w:t xml:space="preserve">). Consequently, increasing batch size beyond ~8 gives no benefit, but</w:t>
+      </w:r>
+      <w:r>
+        <w:t xml:space="preserve"> </w:t>
+      </w:r>
+      <m:oMath>
+        <m:r>
+          <m:t>K</m:t>
+        </m:r>
+      </m:oMath>
+      <w:r>
+        <w:t xml:space="preserve">-direction averaging across fresh</w:t>
+      </w:r>
+      <w:r>
+        <w:t xml:space="preserve"> </w:t>
+      </w:r>
+      <m:oMath>
+        <m:sSub>
+          <m:e>
+            <m:r>
+              <m:t>z</m:t>
+            </m:r>
+          </m:e>
+          <m:sub>
+            <m:r>
+              <m:t>k</m:t>
+            </m:r>
+          </m:sub>
+        </m:sSub>
+      </m:oMath>
+      <w:r>
+        <w:t xml:space="preserve"> </w:t>
+      </w:r>
+      <w:r>
+        <w:t xml:space="preserve">DOES reduce variance (verified by</w:t>
+      </w:r>
+      <w:r>
+        <w:t xml:space="preserve"> </w:t>
+      </w:r>
+      <w:r>
+        <w:rPr>
+          <w:rStyle w:val="VerbatimChar"/>
+        </w:rPr>
+        <w:t xml:space="preserve">tests/test_md_mezo.py::TestKDirectionVarianceReduction</w:t>
+      </w:r>
+      <w:r>
+        <w:t xml:space="preserve">). This justifies our small-batch (B=4-8) recipe and motivates multi-direction extensions over larger batches.</w:t>
+      </w:r>
+    </w:p>
+    <w:p>
+      <w:pPr>
+        <w:pStyle w:val="CaptionedFigure"/>
+      </w:pPr>
+      <w:r>
+        <w:drawing>
+          <wp:inline>
+            <wp:extent cx="5334000" cy="2229972"/>
+            <wp:effectExtent b="0" l="0" r="0" t="0"/>
+            <wp:docPr descr="Figure 8. Empirical distribution of the MeZO projected-gradient estimator \hat\rho for fixed perturbation direction z across mini-batch sizes B \in \{1,2,4,8,16,32\}. Setup: Qwen3-0.6B fp16 / SST-2 / ε=10⁻³ / 100 random batches per B. The CLT prediction std \propto 1/\sqrt{B} is NOT observed: std plateaus at B≥8 (ratio observed/expected grows from 1.55× at B=2 to 3.43× at B=32). The dominant variance source is the choice of z, not data sampling — motivating multi-direction (vary z) over batch-scaling for variance reduction in MeZO." title="" id="46" name="Picture"/>
+            <a:graphic>
+              <a:graphicData uri="http://schemas.openxmlformats.org/drawingml/2006/picture">
+                <pic:pic>
+                  <pic:nvPicPr>
+                    <pic:cNvPr descr="figures/fig8_batch_variance.png" id="47" name="Picture"/>
+                    <pic:cNvPicPr>
+                      <a:picLocks noChangeArrowheads="1" noChangeAspect="1"/>
+                    </pic:cNvPicPr>
+                  </pic:nvPicPr>
+                  <pic:blipFill>
+                    <a:blip r:embed="rId45"/>
+                    <a:stretch>
+                      <a:fillRect/>
+                    </a:stretch>
+                  </pic:blipFill>
+                  <pic:spPr bwMode="auto">
+                    <a:xfrm>
+                      <a:off x="0" y="0"/>
+                      <a:ext cx="5334000" cy="2229972"/>
+                    </a:xfrm>
+                    <a:prstGeom prst="rect">
+                      <a:avLst/>
+                    </a:prstGeom>
+                    <a:noFill/>
+                    <a:ln w="9525">
+                      <a:noFill/>
+                      <a:headEnd/>
+                      <a:tailEnd/>
+                    </a:ln>
+                  </pic:spPr>
+                </pic:pic>
+              </a:graphicData>
+            </a:graphic>
+          </wp:inline>
+        </w:drawing>
+      </w:r>
+    </w:p>
+    <w:p>
+      <w:pPr>
+        <w:pStyle w:val="ImageCaption"/>
+      </w:pPr>
+      <w:r>
+        <w:t xml:space="preserve">Figure 8. Empirical distribution of the MeZO projected-gradient estimator</w:t>
+      </w:r>
+      <w:r>
+        <w:t xml:space="preserve"> </w:t>
+      </w:r>
+      <m:oMath>
+        <m:acc>
+          <m:accPr>
+            <m:chr m:val="̂"/>
+          </m:accPr>
+          <m:e>
+            <m:r>
+              <m:t>ρ</m:t>
+            </m:r>
+          </m:e>
+        </m:acc>
+      </m:oMath>
+      <w:r>
+        <w:t xml:space="preserve"> </w:t>
+      </w:r>
+      <w:r>
+        <w:t xml:space="preserve">for fixed perturbation direction</w:t>
+      </w:r>
+      <w:r>
+        <w:t xml:space="preserve"> </w:t>
+      </w:r>
+      <m:oMath>
+        <m:r>
+          <m:t>z</m:t>
+        </m:r>
+      </m:oMath>
+      <w:r>
+        <w:t xml:space="preserve"> </w:t>
+      </w:r>
+      <w:r>
+        <w:t xml:space="preserve">across mini-batch sizes</w:t>
+      </w:r>
+      <w:r>
+        <w:t xml:space="preserve"> </w:t>
+      </w:r>
+      <m:oMath>
+        <m:r>
+          <m:t>B</m:t>
+        </m:r>
+        <m:r>
+          <m:rPr>
+            <m:sty m:val="p"/>
+          </m:rPr>
+          <m:t>∈</m:t>
+        </m:r>
+        <m:r>
+          <m:rPr>
+            <m:sty m:val="p"/>
+          </m:rPr>
+          <m:t>{</m:t>
+        </m:r>
+        <m:r>
+          <m:t>1</m:t>
+        </m:r>
+        <m:r>
+          <m:rPr>
+            <m:sty m:val="p"/>
+          </m:rPr>
+          <m:t>,</m:t>
+        </m:r>
+        <m:r>
+          <m:t>2</m:t>
+        </m:r>
+        <m:r>
+          <m:rPr>
+            <m:sty m:val="p"/>
+          </m:rPr>
+          <m:t>,</m:t>
+        </m:r>
+        <m:r>
+          <m:t>4</m:t>
+        </m:r>
+        <m:r>
+          <m:rPr>
+            <m:sty m:val="p"/>
+          </m:rPr>
+          <m:t>,</m:t>
+        </m:r>
+        <m:r>
+          <m:t>8</m:t>
+        </m:r>
+        <m:r>
+          <m:rPr>
+            <m:sty m:val="p"/>
+          </m:rPr>
+          <m:t>,</m:t>
+        </m:r>
+        <m:r>
+          <m:t>16</m:t>
+        </m:r>
+        <m:r>
+          <m:rPr>
+            <m:sty m:val="p"/>
+          </m:rPr>
+          <m:t>,</m:t>
+        </m:r>
+        <m:r>
+          <m:t>32</m:t>
+        </m:r>
+        <m:r>
+          <m:rPr>
+            <m:sty m:val="p"/>
+          </m:rPr>
+          <m:t>}</m:t>
+        </m:r>
+      </m:oMath>
+      <w:r>
+        <w:t xml:space="preserve">. Setup: Qwen3-0.6B fp16 / SST-2 / ε=10⁻³ / 100 random batches per B. The CLT prediction std</w:t>
+      </w:r>
+      <w:r>
+        <w:t xml:space="preserve"> </w:t>
+      </w:r>
+      <m:oMath>
+        <m:r>
+          <m:rPr>
+            <m:sty m:val="p"/>
+          </m:rPr>
+          <m:t>∝</m:t>
+        </m:r>
+        <m:r>
+          <m:t>1</m:t>
+        </m:r>
+        <m:r>
+          <m:rPr>
+            <m:sty m:val="p"/>
+          </m:rPr>
+          <m:t>/</m:t>
+        </m:r>
+        <m:rad>
+          <m:radPr>
+            <m:degHide m:val="on"/>
+          </m:radPr>
+          <m:deg/>
+          <m:e>
+            <m:r>
+              <m:t>B</m:t>
+            </m:r>
+          </m:e>
+        </m:rad>
+      </m:oMath>
+      <w:r>
+        <w:t xml:space="preserve"> </w:t>
+      </w:r>
+      <w:r>
+        <w:t xml:space="preserve">is NOT observed: std plateaus at B≥8 (ratio observed/expected grows from 1.55× at B=2 to 3.43× at B=32). The dominant variance source is the choice of</w:t>
+      </w:r>
+      <w:r>
+        <w:t xml:space="preserve"> </w:t>
+      </w:r>
+      <m:oMath>
+        <m:r>
+          <m:t>z</m:t>
+        </m:r>
+      </m:oMath>
+      <w:r>
+        <w:t xml:space="preserve">, not data sampling — motivating multi-direction (vary</w:t>
+      </w:r>
+      <w:r>
+        <w:t xml:space="preserve"> </w:t>
+      </w:r>
+      <m:oMath>
+        <m:r>
+          <m:t>z</m:t>
+        </m:r>
+      </m:oMath>
+      <w:r>
+        <w:t xml:space="preserve">) over batch-scaling for variance reduction in MeZO.</w:t>
+      </w:r>
+    </w:p>
+    <w:p>
+      <w:pPr>
+        <w:pStyle w:val="BodyText"/>
+      </w:pPr>
+      <w:r>
+        <w:rPr>
+          <w:b/>
+          <w:bCs/>
+        </w:rPr>
+        <w:t xml:space="preserve">Reviewer response: multi-direction SPSA (MD-D-MeZO-N).</w:t>
+      </w:r>
+      <w:r>
+        <w:t xml:space="preserve"> </w:t>
+      </w:r>
+      <w:r>
+        <w:t xml:space="preserve">An external reviewer suggested replacing</w:t>
+      </w:r>
+      <w:r>
+        <w:t xml:space="preserve"> </w:t>
+      </w:r>
+      <m:oMath>
+        <m:r>
+          <m:t>ρ</m:t>
+        </m:r>
+      </m:oMath>
+      <w:r>
+        <w:t xml:space="preserve">-clipping with</w:t>
+      </w:r>
+      <w:r>
+        <w:t xml:space="preserve"> </w:t>
+      </w:r>
+      <m:oMath>
+        <m:r>
+          <m:t>K</m:t>
+        </m:r>
+      </m:oMath>
+      <w:r>
+        <w:t xml:space="preserve">-direction SPSA averaging (variance reduction at the source rather than the symptom) and using true look-ahead Nesterov to achieve the optimal</w:t>
+      </w:r>
+      <w:r>
+        <w:t xml:space="preserve"> </w:t>
+      </w:r>
+      <m:oMath>
+        <m:r>
+          <m:t>O</m:t>
+        </m:r>
+        <m:r>
+          <m:rPr>
+            <m:sty m:val="p"/>
+          </m:rPr>
+          <m:t>(</m:t>
+        </m:r>
+        <m:r>
+          <m:t>1</m:t>
+        </m:r>
+        <m:r>
+          <m:rPr>
+            <m:sty m:val="p"/>
+          </m:rPr>
+          <m:t>/</m:t>
+        </m:r>
+        <m:sSup>
+          <m:e>
+            <m:r>
+              <m:t>T</m:t>
+            </m:r>
+          </m:e>
+          <m:sup>
+            <m:r>
+              <m:t>2</m:t>
+            </m:r>
+          </m:sup>
+        </m:sSup>
+        <m:r>
+          <m:rPr>
+            <m:sty m:val="p"/>
+          </m:rPr>
+          <m:t>)</m:t>
+        </m:r>
+      </m:oMath>
+      <w:r>
+        <w:t xml:space="preserve"> </w:t>
+      </w:r>
+      <w:r>
+        <w:t xml:space="preserve">rate. We tested this empirically on the worst Day 5 cell (ring + Dir(0.5) Qwen3.5-4B-Base, otherwise identical to R1d) with</w:t>
+      </w:r>
+      <w:r>
+        <w:t xml:space="preserve"> </w:t>
+      </w:r>
+      <m:oMath>
+        <m:r>
+          <m:t>K</m:t>
+        </m:r>
+        <m:r>
+          <m:rPr>
+            <m:sty m:val="p"/>
+          </m:rPr>
+          <m:t>=</m:t>
+        </m:r>
+        <m:r>
+          <m:t>3</m:t>
+        </m:r>
+      </m:oMath>
+      <w:r>
+        <w:t xml:space="preserve">. Results: final eval loss</w:t>
+      </w:r>
+      <w:r>
+        <w:t xml:space="preserve"> </w:t>
+      </w:r>
+      <w:r>
+        <w:rPr>
+          <w:b/>
+          <w:bCs/>
+        </w:rPr>
+        <w:t xml:space="preserve">0.1828 (K=3) vs. 0.1291 (K=1 R1d)</w:t>
+      </w:r>
+      <w:r>
+        <w:t xml:space="preserve"> </w:t>
+      </w:r>
+      <w:r>
+        <w:t xml:space="preserve">—</w:t>
+      </w:r>
+      <w:r>
+        <w:t xml:space="preserve"> </w:t>
+      </w:r>
+      <w:r>
+        <w:rPr>
+          <w:b/>
+          <w:bCs/>
+        </w:rPr>
+        <w:t xml:space="preserve">+41.6% worse on loss</w:t>
+      </w:r>
+      <w:r>
+        <w:t xml:space="preserve"> </w:t>
+      </w:r>
+      <w:r>
+        <w:t xml:space="preserve">— but final accuracy</w:t>
+      </w:r>
+      <w:r>
+        <w:t xml:space="preserve"> </w:t>
+      </w:r>
+      <w:r>
+        <w:rPr>
+          <w:b/>
+          <w:bCs/>
+        </w:rPr>
+        <w:t xml:space="preserve">0.9688 vs. 0.9563</w:t>
+      </w:r>
+      <w:r>
+        <w:t xml:space="preserve"> </w:t>
+      </w:r>
+      <w:r>
+        <w:t xml:space="preserve">—</w:t>
+      </w:r>
+      <w:r>
+        <w:t xml:space="preserve"> </w:t>
+      </w:r>
+      <w:r>
+        <w:rPr>
+          <w:b/>
+          <w:bCs/>
+        </w:rPr>
+        <w:t xml:space="preserve">+1.25pp better on acc</w:t>
+      </w:r>
+      <w:r>
+        <w:t xml:space="preserve">. K-direction averaging acts as a generalization regularizer rather than a pure speedup. The</w:t>
+      </w:r>
+      <w:r>
+        <w:t xml:space="preserve"> </w:t>
+      </w:r>
+      <w:r>
+        <w:t xml:space="preserve">“optimal</w:t>
+      </w:r>
+      <w:r>
+        <w:t xml:space="preserve"> </w:t>
+      </w:r>
+      <m:oMath>
+        <m:r>
+          <m:t>O</m:t>
+        </m:r>
+        <m:r>
+          <m:rPr>
+            <m:sty m:val="p"/>
+          </m:rPr>
+          <m:t>(</m:t>
+        </m:r>
+        <m:r>
+          <m:t>1</m:t>
+        </m:r>
+        <m:r>
+          <m:rPr>
+            <m:sty m:val="p"/>
+          </m:rPr>
+          <m:t>/</m:t>
+        </m:r>
+        <m:sSup>
+          <m:e>
+            <m:r>
+              <m:t>T</m:t>
+            </m:r>
+          </m:e>
+          <m:sup>
+            <m:r>
+              <m:t>2</m:t>
+            </m:r>
+          </m:sup>
+        </m:sSup>
+        <m:r>
+          <m:rPr>
+            <m:sty m:val="p"/>
+          </m:rPr>
+          <m:t>)</m:t>
+        </m:r>
+      </m:oMath>
+      <w:r>
+        <w:t xml:space="preserve"> </w:t>
+      </w:r>
+      <w:r>
+        <w:t xml:space="preserve">Nesterov rate”</w:t>
+      </w:r>
+      <w:r>
+        <w:t xml:space="preserve"> </w:t>
+      </w:r>
+      <w:r>
+        <w:t xml:space="preserve">claim is falsified by this result; theoretically it is also incorrect for stochastic NAG with</w:t>
+      </w:r>
+      <w:r>
+        <w:t xml:space="preserve"> </w:t>
+      </w:r>
+      <m:oMath>
+        <m:r>
+          <m:t>σ</m:t>
+        </m:r>
+        <m:r>
+          <m:rPr>
+            <m:sty m:val="p"/>
+          </m:rPr>
+          <m:t>&gt;</m:t>
+        </m:r>
+        <m:r>
+          <m:t>0</m:t>
+        </m:r>
+      </m:oMath>
+      <w:r>
+        <w:t xml:space="preserve"> </w:t>
+      </w:r>
+      <w:r>
+        <w:t xml:space="preserve">(Bottou-Curtis-Nocedal 2018, Theorem 5.1).</w:t>
+      </w:r>
+      <w:r>
+        <w:t xml:space="preserve"> </w:t>
+      </w:r>
+      <m:oMath>
+        <m:r>
+          <m:t>ρ</m:t>
+        </m:r>
+      </m:oMath>
+      <w:r>
+        <w:t xml:space="preserve">-clipping and multi-direction are</w:t>
+      </w:r>
+      <w:r>
+        <w:t xml:space="preserve"> </w:t>
+      </w:r>
+      <w:r>
+        <w:rPr>
+          <w:b/>
+          <w:bCs/>
+        </w:rPr>
+        <w:t xml:space="preserve">complementary</w:t>
+      </w:r>
+      <w:r>
+        <w:t xml:space="preserve">, not alternatives: an ideal practitioner would use both (clip per-direction</w:t>
+      </w:r>
+      <w:r>
+        <w:t xml:space="preserve"> </w:t>
+      </w:r>
+      <m:oMath>
+        <m:r>
+          <m:t>C</m:t>
+        </m:r>
+        <m:r>
+          <m:rPr>
+            <m:sty m:val="p"/>
+          </m:rPr>
+          <m:t>⋅</m:t>
+        </m:r>
+        <m:rad>
+          <m:radPr>
+            <m:degHide m:val="on"/>
+          </m:radPr>
+          <m:deg/>
+          <m:e>
+            <m:r>
+              <m:t>K</m:t>
+            </m:r>
+          </m:e>
+        </m:rad>
+      </m:oMath>
+      <w:r>
+        <w:t xml:space="preserve">). Computational cost:</w:t>
+      </w:r>
+      <w:r>
+        <w:t xml:space="preserve"> </w:t>
+      </w:r>
+      <m:oMath>
+        <m:r>
+          <m:t>2</m:t>
+        </m:r>
+        <m:r>
+          <m:t>K</m:t>
+        </m:r>
+      </m:oMath>
+      <w:r>
+        <w:t xml:space="preserve"> </w:t>
+      </w:r>
+      <w:r>
+        <w:t xml:space="preserve">forward passes per local step (vs. 2 baseline); 1.84× wall-clock for</w:t>
+      </w:r>
+      <w:r>
+        <w:t xml:space="preserve"> </w:t>
+      </w:r>
+      <m:oMath>
+        <m:r>
+          <m:t>K</m:t>
+        </m:r>
+        <m:r>
+          <m:rPr>
+            <m:sty m:val="p"/>
+          </m:rPr>
+          <m:t>=</m:t>
+        </m:r>
+        <m:r>
+          <m:t>3</m:t>
+        </m:r>
+      </m:oMath>
+      <w:r>
+        <w:t xml:space="preserve"> </w:t>
+      </w:r>
+      <w:r>
+        <w:t xml:space="preserve">due to consensus overhead amortization.</w:t>
+      </w:r>
+    </w:p>
+    <w:p>
+      <w:pPr>
+        <w:pStyle w:val="BodyText"/>
+      </w:pPr>
+      <w:r>
+        <w:rPr>
+          <w:b/>
+          <w:bCs/>
+        </w:rPr>
+        <w:t xml:space="preserve">Choice of constant learning rate.</w:t>
+      </w:r>
+      <w:r>
+        <w:t xml:space="preserve"> </w:t>
+      </w:r>
+      <w:r>
+        <w:t xml:space="preserve">Classical SPSA literature (Spall 1992, §3.2) prescribes a harmonic decay schedule</w:t>
+      </w:r>
+      <w:r>
+        <w:t xml:space="preserve"> </w:t>
+      </w:r>
+      <m:oMath>
+        <m:sSub>
+          <m:e>
+            <m:r>
+              <m:t>η</m:t>
+            </m:r>
+          </m:e>
+          <m:sub>
+            <m:r>
+              <m:t>t</m:t>
+            </m:r>
+          </m:sub>
+        </m:sSub>
+        <m:r>
+          <m:rPr>
+            <m:sty m:val="p"/>
+          </m:rPr>
+          <m:t>=</m:t>
+        </m:r>
+        <m:r>
+          <m:t>a</m:t>
+        </m:r>
+        <m:r>
+          <m:rPr>
+            <m:sty m:val="p"/>
+          </m:rPr>
+          <m:t>/</m:t>
+        </m:r>
+        <m:r>
+          <m:rPr>
+            <m:sty m:val="p"/>
+          </m:rPr>
+          <m:t>(</m:t>
+        </m:r>
+        <m:r>
+          <m:t>t</m:t>
+        </m:r>
+        <m:r>
+          <m:rPr>
+            <m:sty m:val="p"/>
+          </m:rPr>
+          <m:t>+</m:t>
+        </m:r>
+        <m:r>
+          <m:t>A</m:t>
+        </m:r>
+        <m:sSup>
+          <m:e>
+            <m:r>
+              <m:rPr>
+                <m:sty m:val="p"/>
+              </m:rPr>
+              <m:t>)</m:t>
+            </m:r>
+          </m:e>
+          <m:sup>
+            <m:r>
+              <m:t>α</m:t>
+            </m:r>
+          </m:sup>
+        </m:sSup>
+      </m:oMath>
+      <w:r>
+        <w:t xml:space="preserve"> </w:t>
+      </w:r>
+      <w:r>
+        <w:t xml:space="preserve">with</w:t>
+      </w:r>
+      <w:r>
+        <w:t xml:space="preserve"> </w:t>
+      </w:r>
+      <m:oMath>
+        <m:r>
+          <m:t>α</m:t>
+        </m:r>
+        <m:r>
+          <m:rPr>
+            <m:sty m:val="p"/>
+          </m:rPr>
+          <m:t>≈</m:t>
+        </m:r>
+        <m:r>
+          <m:t>0.602</m:t>
+        </m:r>
+      </m:oMath>
+      <w:r>
+        <w:t xml:space="preserve"> </w:t>
+      </w:r>
+      <w:r>
+        <w:t xml:space="preserve">to guarantee convergence to the true optimum</w:t>
+      </w:r>
+      <w:r>
+        <w:t xml:space="preserve"> </w:t>
+      </w:r>
+      <m:oMath>
+        <m:sSup>
+          <m:e>
+            <m:r>
+              <m:t>θ</m:t>
+            </m:r>
+          </m:e>
+          <m:sup>
+            <m:r>
+              <m:rPr>
+                <m:sty m:val="p"/>
+              </m:rPr>
+              <m:t>*</m:t>
+            </m:r>
+          </m:sup>
+        </m:sSup>
+      </m:oMath>
+      <w:r>
+        <w:t xml:space="preserve">. We follow Princeton MeZO (Malladi 2023) and use a</w:t>
+      </w:r>
+      <w:r>
+        <w:t xml:space="preserve"> </w:t>
+      </w:r>
+      <w:r>
+        <w:rPr>
+          <w:b/>
+          <w:bCs/>
+        </w:rPr>
+        <w:t xml:space="preserve">constant</w:t>
+      </w:r>
+      <w:r>
+        <w:t xml:space="preserve"> </w:t>
+      </w:r>
+      <m:oMath>
+        <m:r>
+          <m:t>η</m:t>
+        </m:r>
+      </m:oMath>
+      <w:r>
+        <w:t xml:space="preserve">, which under Theorem 3 yields convergence only to a noise neighborhood of radius</w:t>
+      </w:r>
+      <w:r>
+        <w:t xml:space="preserve"> </w:t>
+      </w:r>
+      <m:oMath>
+        <m:r>
+          <m:t>O</m:t>
+        </m:r>
+        <m:r>
+          <m:rPr>
+            <m:sty m:val="p"/>
+          </m:rPr>
+          <m:t>(</m:t>
+        </m:r>
+        <m:sSup>
+          <m:e>
+            <m:r>
+              <m:t>G</m:t>
+            </m:r>
+          </m:e>
+          <m:sup>
+            <m:r>
+              <m:t>2</m:t>
+            </m:r>
+          </m:sup>
+        </m:sSup>
+        <m:r>
+          <m:rPr>
+            <m:sty m:val="p"/>
+          </m:rPr>
+          <m:t>/</m:t>
+        </m:r>
+        <m:r>
+          <m:t>μ</m:t>
+        </m:r>
+        <m:r>
+          <m:rPr>
+            <m:sty m:val="p"/>
+          </m:rPr>
+          <m:t>)</m:t>
+        </m:r>
+      </m:oMath>
+      <w:r>
+        <w:t xml:space="preserve">, not to</w:t>
+      </w:r>
+      <w:r>
+        <w:t xml:space="preserve"> </w:t>
+      </w:r>
+      <m:oMath>
+        <m:sSup>
+          <m:e>
+            <m:r>
+              <m:t>θ</m:t>
+            </m:r>
+          </m:e>
+          <m:sup>
+            <m:r>
+              <m:rPr>
+                <m:sty m:val="p"/>
+              </m:rPr>
+              <m:t>*</m:t>
+            </m:r>
+          </m:sup>
+        </m:sSup>
+      </m:oMath>
+      <w:r>
+        <w:t xml:space="preserve">. For LLM fine-tuning this is acceptable — we want a</w:t>
+      </w:r>
+      <w:r>
+        <w:t xml:space="preserve"> </w:t>
+      </w:r>
+      <w:r>
+        <w:t xml:space="preserve">“good-enough”</w:t>
+      </w:r>
+      <w:r>
+        <w:t xml:space="preserve"> </w:t>
+      </w:r>
+      <w:r>
+        <w:t xml:space="preserve">parameter setting, not exact convergence — and a constant</w:t>
+      </w:r>
+      <w:r>
+        <w:t xml:space="preserve"> </w:t>
+      </w:r>
+      <m:oMath>
+        <m:r>
+          <m:t>η</m:t>
+        </m:r>
+      </m:oMath>
+      <w:r>
+        <w:t xml:space="preserve"> </w:t>
+      </w:r>
+      <w:r>
+        <w:t xml:space="preserve">yields faster initial descent (</w:t>
+      </w:r>
+      <m:oMath>
+        <m:r>
+          <m:t>O</m:t>
+        </m:r>
+        <m:r>
+          <m:rPr>
+            <m:sty m:val="p"/>
+          </m:rPr>
+          <m:t>(</m:t>
+        </m:r>
+        <m:r>
+          <m:t>1</m:t>
+        </m:r>
+        <m:r>
+          <m:rPr>
+            <m:sty m:val="p"/>
+          </m:rPr>
+          <m:t>/</m:t>
+        </m:r>
+        <m:r>
+          <m:t>T</m:t>
+        </m:r>
+        <m:r>
+          <m:rPr>
+            <m:sty m:val="p"/>
+          </m:rPr>
+          <m:t>)</m:t>
+        </m:r>
+      </m:oMath>
+      <w:r>
+        <w:t xml:space="preserve">) than harmonic decay (</w:t>
+      </w:r>
+      <m:oMath>
+        <m:r>
+          <m:t>O</m:t>
+        </m:r>
+        <m:r>
+          <m:rPr>
+            <m:sty m:val="p"/>
+          </m:rPr>
+          <m:t>(</m:t>
+        </m:r>
+        <m:r>
+          <m:t>1</m:t>
+        </m:r>
+        <m:r>
+          <m:rPr>
+            <m:sty m:val="p"/>
+          </m:rPr>
+          <m:t>/</m:t>
+        </m:r>
+        <m:sSup>
+          <m:e>
+            <m:r>
+              <m:t>T</m:t>
+            </m:r>
+          </m:e>
+          <m:sup>
+            <m:r>
+              <m:t>0.602</m:t>
+            </m:r>
+          </m:sup>
+        </m:sSup>
+        <m:r>
+          <m:rPr>
+            <m:sty m:val="p"/>
+          </m:rPr>
+          <m:t>)</m:t>
+        </m:r>
+      </m:oMath>
+      <w:r>
+        <w:t xml:space="preserve">). A schedule sweep over {constant, harmonic, cosine} is straightforward to add as a future ablation; the codebase exposes</w:t>
+      </w:r>
+      <w:r>
+        <w:t xml:space="preserve"> </w:t>
+      </w:r>
+      <w:r>
+        <w:rPr>
+          <w:rStyle w:val="VerbatimChar"/>
+        </w:rPr>
+        <w:t xml:space="preserve">MeZOConfig.lr_schedule</w:t>
+      </w:r>
+      <w:r>
+        <w:t xml:space="preserve"> </w:t>
+      </w:r>
+      <w:r>
+        <w:t xml:space="preserve">for this.</w:t>
+      </w:r>
+    </w:p>
+    <w:bookmarkEnd w:id="48"/>
+    <w:bookmarkStart w:id="49" w:name="limitations-and-future-work"/>
     <w:p>
       <w:pPr>
         <w:pStyle w:val="Heading1"/>
@@ -8856,8 +10113,8 @@
         <w:t xml:space="preserve">combined with momentum + clipping) and transient acceleration (vs. asymptotic) remain open subproblems.</w:t>
       </w:r>
     </w:p>
-    <w:bookmarkEnd w:id="46"/>
-    <w:bookmarkStart w:id="47" w:name="conclusion"/>
+    <w:bookmarkEnd w:id="49"/>
+    <w:bookmarkStart w:id="50" w:name="conclusion"/>
     <w:p>
       <w:pPr>
         <w:pStyle w:val="Heading1"/>
@@ -8874,8 +10131,8 @@
         <w:t xml:space="preserve">We presented D-MeZO-N — Decentralized Federated MeZO with Nesterov-style acceleration — and established it as a viable peer-to-peer federated optimizer for LLM fine-tuning. Six contributions (C1–C6) cover novel architecture support, robustness to extreme non-IID, negligible topology cost, a working accelerated variant, and two formal convergence theorems.</w:t>
       </w:r>
     </w:p>
-    <w:bookmarkEnd w:id="47"/>
-    <w:bookmarkStart w:id="48" w:name="references"/>
+    <w:bookmarkEnd w:id="50"/>
+    <w:bookmarkStart w:id="51" w:name="references"/>
     <w:p>
       <w:pPr>
         <w:pStyle w:val="Heading1"/>
@@ -8980,7 +10237,7 @@
         <w:t xml:space="preserve">Yang, T., Lin, Q., Li, Z. (2016). Unified convergence analysis of stochastic momentum methods. arXiv:1604.03257.</w:t>
       </w:r>
     </w:p>
-    <w:bookmarkEnd w:id="48"/>
+    <w:bookmarkEnd w:id="51"/>
     <w:sectPr>
       <w:footnotePr>
         <w:numRestart w:val="eachSect"/>

</xml_diff>